<commit_message>
Added SpawnBrowser.  Message descriptions cached in the PacketCatalog by Inference.  Handlers do not run if the opcode is not defined (to allow back level captures to be processed).  NewZone added to inference.
</commit_message>
<xml_diff>
--- a/Glass/Doc/Patch Instructions.docx
+++ b/Glass/Doc/Patch Instructions.docx
@@ -1984,7 +1984,13 @@
         <w:t>Size.</w:t>
       </w:r>
       <w:r>
-        <w:t xml:space="preserve"> Historically small and fixed. Two spawn IDs plus a small amount of additional data.</w:t>
+        <w:t xml:space="preserve"> Historically small and fixed</w:t>
+      </w:r>
+      <w:r>
+        <w:t xml:space="preserve"> (40 bytes)</w:t>
+      </w:r>
+      <w:r>
+        <w:t>. Two spawn IDs plus a small amount of additional data.</w:t>
       </w:r>
     </w:p>
     <w:p>

</xml_diff>